<commit_message>
Finished Chapter 1 Your-Turn Technology Plan
</commit_message>
<xml_diff>
--- a/HTML_CSS/Exercises/HTML_CH01_EX/YourTurn/technology_plan.docx
+++ b/HTML_CSS/Exercises/HTML_CH01_EX/YourTurn/technology_plan.docx
@@ -225,7 +225,28 @@
         <w:t xml:space="preserve"> navigating anywhere</w:t>
       </w:r>
       <w:r>
-        <w:t xml:space="preserve"> 1000x </w:t>
+        <w:t xml:space="preserve"> </w:t>
+      </w:r>
+      <w:r>
+        <w:t>1 thousand times</w:t>
+      </w:r>
+      <w:r>
+        <w:t xml:space="preserve"> easier. It has become a major tool in people’s everyday lives.</w:t>
+      </w:r>
+      <w:r>
+        <w:t xml:space="preserve"> Without GPS, </w:t>
+      </w:r>
+      <w:r>
+        <w:t xml:space="preserve">we would still be using paper maps to figure out where we’re trying to go. It </w:t>
+      </w:r>
+      <w:r>
+        <w:t xml:space="preserve">has made traveling and vacationing a lot more fun and easier because </w:t>
+      </w:r>
+      <w:r>
+        <w:t>having GPS means that you have a very detailed map of the world</w:t>
+      </w:r>
+      <w:r>
+        <w:t xml:space="preserve"> at your fingertips. </w:t>
       </w:r>
     </w:p>
     <w:p>
@@ -352,6 +373,15 @@
             <w:pPr>
               <w:cnfStyle w:val="000000100000" w:firstRow="0" w:lastRow="0" w:firstColumn="0" w:lastColumn="0" w:oddVBand="0" w:evenVBand="0" w:oddHBand="1" w:evenHBand="0" w:firstRowFirstColumn="0" w:firstRowLastColumn="0" w:lastRowFirstColumn="0" w:lastRowLastColumn="0"/>
             </w:pPr>
+            <w:r>
+              <w:t>To show off new and important</w:t>
+            </w:r>
+            <w:r>
+              <w:t xml:space="preserve"> advances</w:t>
+            </w:r>
+            <w:r>
+              <w:t xml:space="preserve"> in technology</w:t>
+            </w:r>
           </w:p>
         </w:tc>
       </w:tr>
@@ -391,6 +421,18 @@
             <w:pPr>
               <w:cnfStyle w:val="000000000000" w:firstRow="0" w:lastRow="0" w:firstColumn="0" w:lastColumn="0" w:oddVBand="0" w:evenVBand="0" w:oddHBand="0" w:evenHBand="0" w:firstRowFirstColumn="0" w:firstRowLastColumn="0" w:lastRowFirstColumn="0" w:lastRowLastColumn="0"/>
             </w:pPr>
+            <w:r>
+              <w:t xml:space="preserve">16 </w:t>
+            </w:r>
+            <w:r>
+              <w:t>–</w:t>
+            </w:r>
+            <w:r>
+              <w:t xml:space="preserve"> </w:t>
+            </w:r>
+            <w:r>
+              <w:t>75 years old, people interested in technology</w:t>
+            </w:r>
           </w:p>
         </w:tc>
       </w:tr>
@@ -431,6 +473,18 @@
             <w:pPr>
               <w:cnfStyle w:val="000000100000" w:firstRow="0" w:lastRow="0" w:firstColumn="0" w:lastColumn="0" w:oddVBand="0" w:evenVBand="0" w:oddHBand="1" w:evenHBand="0" w:firstRowFirstColumn="0" w:firstRowLastColumn="0" w:lastRowFirstColumn="0" w:lastRowLastColumn="0"/>
             </w:pPr>
+            <w:r>
+              <w:t xml:space="preserve">Sci-fi graphics, </w:t>
+            </w:r>
+            <w:r>
+              <w:t>pictures of the tech being talked about</w:t>
+            </w:r>
+            <w:r>
+              <w:t>, and more tech style</w:t>
+            </w:r>
+            <w:r>
+              <w:t xml:space="preserve"> pictures</w:t>
+            </w:r>
           </w:p>
         </w:tc>
       </w:tr>
@@ -470,6 +524,18 @@
             <w:pPr>
               <w:cnfStyle w:val="000000000000" w:firstRow="0" w:lastRow="0" w:firstColumn="0" w:lastColumn="0" w:oddVBand="0" w:evenVBand="0" w:oddHBand="0" w:evenHBand="0" w:firstRowFirstColumn="0" w:firstRowLastColumn="0" w:lastRowFirstColumn="0" w:lastRowLastColumn="0"/>
             </w:pPr>
+            <w:r>
+              <w:t>Light b</w:t>
+            </w:r>
+            <w:r>
+              <w:t xml:space="preserve">lues and </w:t>
+            </w:r>
+            <w:r>
+              <w:t xml:space="preserve">darker </w:t>
+            </w:r>
+            <w:r>
+              <w:t>greens, with black and white accents</w:t>
+            </w:r>
           </w:p>
         </w:tc>
       </w:tr>
@@ -510,6 +576,18 @@
             <w:pPr>
               <w:cnfStyle w:val="000000100000" w:firstRow="0" w:lastRow="0" w:firstColumn="0" w:lastColumn="0" w:oddVBand="0" w:evenVBand="0" w:oddHBand="1" w:evenHBand="0" w:firstRowFirstColumn="0" w:firstRowLastColumn="0" w:lastRowFirstColumn="0" w:lastRowLastColumn="0"/>
             </w:pPr>
+            <w:r>
+              <w:t xml:space="preserve">Text describing </w:t>
+            </w:r>
+            <w:r>
+              <w:t>all</w:t>
+            </w:r>
+            <w:r>
+              <w:t xml:space="preserve"> the images used in the </w:t>
+            </w:r>
+            <w:r>
+              <w:t>website, text size is able to be adjusted</w:t>
+            </w:r>
           </w:p>
         </w:tc>
       </w:tr>
@@ -549,6 +627,24 @@
             <w:pPr>
               <w:cnfStyle w:val="000000000000" w:firstRow="0" w:lastRow="0" w:firstColumn="0" w:lastColumn="0" w:oddVBand="0" w:evenVBand="0" w:oddHBand="0" w:evenHBand="0" w:firstRowFirstColumn="0" w:firstRowLastColumn="0" w:lastRowFirstColumn="0" w:lastRowLastColumn="0"/>
             </w:pPr>
+            <w:r>
+              <w:t>Plan out the base of the website</w:t>
+            </w:r>
+            <w:r>
+              <w:t xml:space="preserve">, research and write all of the </w:t>
+            </w:r>
+            <w:r>
+              <w:t>information</w:t>
+            </w:r>
+            <w:r>
+              <w:t xml:space="preserve"> onto the website, add all of the graphics and colors, check that the website is working and looking right</w:t>
+            </w:r>
+            <w:r>
+              <w:t>, make sure that the website is accessible to all users, and then check that the website</w:t>
+            </w:r>
+            <w:r>
+              <w:t xml:space="preserve"> is useable on phones, tablets, and websites.</w:t>
+            </w:r>
           </w:p>
         </w:tc>
       </w:tr>

</xml_diff>